<commit_message>
Resolve SQLite schema and presentation inconsistencies
Co-authored-by: arena-agent <297053741+arena-agent@users.noreply.github.com>
</commit_message>
<xml_diff>
--- a/reports/lab7/LR7_Report_Variant15.docx
+++ b/reports/lab7/LR7_Report_Variant15.docx
@@ -255,655 +255,219 @@
           <w:rFonts w:ascii="Times New Roman" w:hAnsi="Times New Roman"/>
           <w:sz w:val="28"/>
         </w:rPr>
-        <w:t>Презентация показывает предметную область, назначение портала, структуру базы SQLite, разделы интерфейса, учебные планы, справочники и ограничения прототипа.</w:t>
+        <w:t>Презентация содержит девять слайдов:</w:t>
       </w:r>
     </w:p>
     <w:p>
       <w:pPr>
-        <w:spacing w:before="200" w:after="80"/>
-        <w:jc w:val="center"/>
+        <w:spacing w:line="276" w:lineRule="auto" w:after="60"/>
+        <w:ind w:left="709"/>
+        <w:jc w:val="both"/>
       </w:pPr>
       <w:r>
-        <w:drawing>
-          <wp:inline xmlns:a="http://schemas.openxmlformats.org/drawingml/2006/main" xmlns:pic="http://schemas.openxmlformats.org/drawingml/2006/picture">
-            <wp:extent cx="5760000" cy="3240000"/>
-            <wp:docPr id="1" name="Picture 1"/>
-            <wp:cNvGraphicFramePr>
-              <a:graphicFrameLocks noChangeAspect="1"/>
-            </wp:cNvGraphicFramePr>
-            <a:graphic>
-              <a:graphicData uri="http://schemas.openxmlformats.org/drawingml/2006/picture">
-                <pic:pic>
-                  <pic:nvPicPr>
-                    <pic:cNvPr id="0" name="slide_01_title.png"/>
-                    <pic:cNvPicPr/>
-                  </pic:nvPicPr>
-                  <pic:blipFill>
-                    <a:blip r:embed="rId10"/>
-                    <a:stretch>
-                      <a:fillRect/>
-                    </a:stretch>
-                  </pic:blipFill>
-                  <pic:spPr>
-                    <a:xfrm>
-                      <a:off x="0" y="0"/>
-                      <a:ext cx="5760000" cy="3240000"/>
-                    </a:xfrm>
-                    <a:prstGeom prst="rect"/>
-                  </pic:spPr>
-                </pic:pic>
-              </a:graphicData>
-            </a:graphic>
-          </wp:inline>
-        </w:drawing>
+        <w:rPr>
+          <w:rFonts w:ascii="Times New Roman" w:hAnsi="Times New Roman"/>
+          <w:b/>
+          <w:sz w:val="28"/>
+        </w:rPr>
+        <w:t xml:space="preserve">1. </w:t>
+      </w:r>
+      <w:r>
+        <w:rPr>
+          <w:rFonts w:ascii="Times New Roman" w:hAnsi="Times New Roman"/>
+          <w:sz w:val="28"/>
+        </w:rPr>
+        <w:t>назначение портала;</w:t>
       </w:r>
     </w:p>
     <w:p>
       <w:pPr>
-        <w:spacing w:before="80" w:after="240"/>
-        <w:jc w:val="center"/>
+        <w:spacing w:line="276" w:lineRule="auto" w:after="60"/>
+        <w:ind w:left="709"/>
+        <w:jc w:val="both"/>
       </w:pPr>
       <w:r>
         <w:rPr>
           <w:rFonts w:ascii="Times New Roman" w:hAnsi="Times New Roman"/>
-          <w:i/>
-          <w:sz w:val="24"/>
+          <w:b/>
+          <w:sz w:val="28"/>
         </w:rPr>
-        <w:t>Рисунок 1 — Титульный слайд</w:t>
+        <w:t xml:space="preserve">2. </w:t>
+      </w:r>
+      <w:r>
+        <w:rPr>
+          <w:rFonts w:ascii="Times New Roman" w:hAnsi="Times New Roman"/>
+          <w:sz w:val="28"/>
+        </w:rPr>
+        <w:t>предметная область;</w:t>
       </w:r>
     </w:p>
     <w:p>
       <w:pPr>
-        <w:spacing w:before="200" w:after="80"/>
-        <w:jc w:val="center"/>
+        <w:spacing w:line="276" w:lineRule="auto" w:after="60"/>
+        <w:ind w:left="709"/>
+        <w:jc w:val="both"/>
       </w:pPr>
       <w:r>
-        <w:drawing>
-          <wp:inline xmlns:a="http://schemas.openxmlformats.org/drawingml/2006/main" xmlns:pic="http://schemas.openxmlformats.org/drawingml/2006/picture">
-            <wp:extent cx="5760000" cy="3240000"/>
-            <wp:docPr id="2" name="Picture 2"/>
-            <wp:cNvGraphicFramePr>
-              <a:graphicFrameLocks noChangeAspect="1"/>
-            </wp:cNvGraphicFramePr>
-            <a:graphic>
-              <a:graphicData uri="http://schemas.openxmlformats.org/drawingml/2006/picture">
-                <pic:pic>
-                  <pic:nvPicPr>
-                    <pic:cNvPr id="0" name="slide_02_context_goals.png"/>
-                    <pic:cNvPicPr/>
-                  </pic:nvPicPr>
-                  <pic:blipFill>
-                    <a:blip r:embed="rId11"/>
-                    <a:stretch>
-                      <a:fillRect/>
-                    </a:stretch>
-                  </pic:blipFill>
-                  <pic:spPr>
-                    <a:xfrm>
-                      <a:off x="0" y="0"/>
-                      <a:ext cx="5760000" cy="3240000"/>
-                    </a:xfrm>
-                    <a:prstGeom prst="rect"/>
-                  </pic:spPr>
-                </pic:pic>
-              </a:graphicData>
-            </a:graphic>
-          </wp:inline>
-        </w:drawing>
+        <w:rPr>
+          <w:rFonts w:ascii="Times New Roman" w:hAnsi="Times New Roman"/>
+          <w:b/>
+          <w:sz w:val="28"/>
+        </w:rPr>
+        <w:t xml:space="preserve">3. </w:t>
+      </w:r>
+      <w:r>
+        <w:rPr>
+          <w:rFonts w:ascii="Times New Roman" w:hAnsi="Times New Roman"/>
+          <w:sz w:val="28"/>
+        </w:rPr>
+        <w:t>используемый стек;</w:t>
       </w:r>
     </w:p>
     <w:p>
       <w:pPr>
-        <w:spacing w:before="80" w:after="240"/>
-        <w:jc w:val="center"/>
+        <w:spacing w:line="276" w:lineRule="auto" w:after="60"/>
+        <w:ind w:left="709"/>
+        <w:jc w:val="both"/>
       </w:pPr>
       <w:r>
         <w:rPr>
           <w:rFonts w:ascii="Times New Roman" w:hAnsi="Times New Roman"/>
-          <w:i/>
-          <w:sz w:val="24"/>
+          <w:b/>
+          <w:sz w:val="28"/>
         </w:rPr>
-        <w:t>Рисунок 2 — Контекст и цели</w:t>
+        <w:t xml:space="preserve">4. </w:t>
+      </w:r>
+      <w:r>
+        <w:rPr>
+          <w:rFonts w:ascii="Times New Roman" w:hAnsi="Times New Roman"/>
+          <w:sz w:val="28"/>
+        </w:rPr>
+        <w:t>состав данных SQLite;</w:t>
       </w:r>
     </w:p>
     <w:p>
       <w:pPr>
-        <w:spacing w:before="200" w:after="80"/>
-        <w:jc w:val="center"/>
+        <w:spacing w:line="276" w:lineRule="auto" w:after="60"/>
+        <w:ind w:left="709"/>
+        <w:jc w:val="both"/>
       </w:pPr>
       <w:r>
-        <w:drawing>
-          <wp:inline xmlns:a="http://schemas.openxmlformats.org/drawingml/2006/main" xmlns:pic="http://schemas.openxmlformats.org/drawingml/2006/picture">
-            <wp:extent cx="5760000" cy="3240000"/>
-            <wp:docPr id="3" name="Picture 3"/>
-            <wp:cNvGraphicFramePr>
-              <a:graphicFrameLocks noChangeAspect="1"/>
-            </wp:cNvGraphicFramePr>
-            <a:graphic>
-              <a:graphicData uri="http://schemas.openxmlformats.org/drawingml/2006/picture">
-                <pic:pic>
-                  <pic:nvPicPr>
-                    <pic:cNvPr id="0" name="slide_03_architecture_stack.png"/>
-                    <pic:cNvPicPr/>
-                  </pic:nvPicPr>
-                  <pic:blipFill>
-                    <a:blip r:embed="rId12"/>
-                    <a:stretch>
-                      <a:fillRect/>
-                    </a:stretch>
-                  </pic:blipFill>
-                  <pic:spPr>
-                    <a:xfrm>
-                      <a:off x="0" y="0"/>
-                      <a:ext cx="5760000" cy="3240000"/>
-                    </a:xfrm>
-                    <a:prstGeom prst="rect"/>
-                  </pic:spPr>
-                </pic:pic>
-              </a:graphicData>
-            </a:graphic>
-          </wp:inline>
-        </w:drawing>
+        <w:rPr>
+          <w:rFonts w:ascii="Times New Roman" w:hAnsi="Times New Roman"/>
+          <w:b/>
+          <w:sz w:val="28"/>
+        </w:rPr>
+        <w:t xml:space="preserve">5. </w:t>
+      </w:r>
+      <w:r>
+        <w:rPr>
+          <w:rFonts w:ascii="Times New Roman" w:hAnsi="Times New Roman"/>
+          <w:sz w:val="28"/>
+        </w:rPr>
+        <w:t>разделы портала;</w:t>
       </w:r>
     </w:p>
     <w:p>
       <w:pPr>
-        <w:spacing w:before="80" w:after="240"/>
-        <w:jc w:val="center"/>
+        <w:spacing w:line="276" w:lineRule="auto" w:after="60"/>
+        <w:ind w:left="709"/>
+        <w:jc w:val="both"/>
       </w:pPr>
       <w:r>
         <w:rPr>
           <w:rFonts w:ascii="Times New Roman" w:hAnsi="Times New Roman"/>
-          <w:i/>
-          <w:sz w:val="24"/>
+          <w:b/>
+          <w:sz w:val="28"/>
         </w:rPr>
-        <w:t>Рисунок 3 — Архитектура</w:t>
+        <w:t xml:space="preserve">6. </w:t>
+      </w:r>
+      <w:r>
+        <w:rPr>
+          <w:rFonts w:ascii="Times New Roman" w:hAnsi="Times New Roman"/>
+          <w:sz w:val="28"/>
+        </w:rPr>
+        <w:t>работа с учебным планом;</w:t>
       </w:r>
     </w:p>
     <w:p>
       <w:pPr>
-        <w:spacing w:before="200" w:after="80"/>
-        <w:jc w:val="center"/>
+        <w:spacing w:line="276" w:lineRule="auto" w:after="60"/>
+        <w:ind w:left="709"/>
+        <w:jc w:val="both"/>
       </w:pPr>
       <w:r>
-        <w:drawing>
-          <wp:inline xmlns:a="http://schemas.openxmlformats.org/drawingml/2006/main" xmlns:pic="http://schemas.openxmlformats.org/drawingml/2006/picture">
-            <wp:extent cx="5760000" cy="3240000"/>
-            <wp:docPr id="4" name="Picture 4"/>
-            <wp:cNvGraphicFramePr>
-              <a:graphicFrameLocks noChangeAspect="1"/>
-            </wp:cNvGraphicFramePr>
-            <a:graphic>
-              <a:graphicData uri="http://schemas.openxmlformats.org/drawingml/2006/picture">
-                <pic:pic>
-                  <pic:nvPicPr>
-                    <pic:cNvPr id="0" name="slide_04_data_model.png"/>
-                    <pic:cNvPicPr/>
-                  </pic:nvPicPr>
-                  <pic:blipFill>
-                    <a:blip r:embed="rId13"/>
-                    <a:stretch>
-                      <a:fillRect/>
-                    </a:stretch>
-                  </pic:blipFill>
-                  <pic:spPr>
-                    <a:xfrm>
-                      <a:off x="0" y="0"/>
-                      <a:ext cx="5760000" cy="3240000"/>
-                    </a:xfrm>
-                    <a:prstGeom prst="rect"/>
-                  </pic:spPr>
-                </pic:pic>
-              </a:graphicData>
-            </a:graphic>
-          </wp:inline>
-        </w:drawing>
+        <w:rPr>
+          <w:rFonts w:ascii="Times New Roman" w:hAnsi="Times New Roman"/>
+          <w:b/>
+          <w:sz w:val="28"/>
+        </w:rPr>
+        <w:t xml:space="preserve">7. </w:t>
+      </w:r>
+      <w:r>
+        <w:rPr>
+          <w:rFonts w:ascii="Times New Roman" w:hAnsi="Times New Roman"/>
+          <w:sz w:val="28"/>
+        </w:rPr>
+        <w:t>запуск и проверка;</w:t>
       </w:r>
     </w:p>
     <w:p>
       <w:pPr>
-        <w:spacing w:before="80" w:after="240"/>
-        <w:jc w:val="center"/>
+        <w:spacing w:line="276" w:lineRule="auto" w:after="60"/>
+        <w:ind w:left="709"/>
+        <w:jc w:val="both"/>
       </w:pPr>
       <w:r>
         <w:rPr>
           <w:rFonts w:ascii="Times New Roman" w:hAnsi="Times New Roman"/>
-          <w:i/>
-          <w:sz w:val="24"/>
+          <w:b/>
+          <w:sz w:val="28"/>
         </w:rPr>
-        <w:t>Рисунок 4 — Модель данных</w:t>
+        <w:t xml:space="preserve">8. </w:t>
+      </w:r>
+      <w:r>
+        <w:rPr>
+          <w:rFonts w:ascii="Times New Roman" w:hAnsi="Times New Roman"/>
+          <w:sz w:val="28"/>
+        </w:rPr>
+        <w:t>ограничения прототипа;</w:t>
       </w:r>
     </w:p>
     <w:p>
       <w:pPr>
-        <w:spacing w:before="200" w:after="80"/>
-        <w:jc w:val="center"/>
+        <w:spacing w:line="276" w:lineRule="auto" w:after="60"/>
+        <w:ind w:left="709"/>
+        <w:jc w:val="both"/>
       </w:pPr>
       <w:r>
-        <w:drawing>
-          <wp:inline xmlns:a="http://schemas.openxmlformats.org/drawingml/2006/main" xmlns:pic="http://schemas.openxmlformats.org/drawingml/2006/picture">
-            <wp:extent cx="5760000" cy="3240000"/>
-            <wp:docPr id="5" name="Picture 5"/>
-            <wp:cNvGraphicFramePr>
-              <a:graphicFrameLocks noChangeAspect="1"/>
-            </wp:cNvGraphicFramePr>
-            <a:graphic>
-              <a:graphicData uri="http://schemas.openxmlformats.org/drawingml/2006/picture">
-                <pic:pic>
-                  <pic:nvPicPr>
-                    <pic:cNvPr id="0" name="slide_05_portal_structure.png"/>
-                    <pic:cNvPicPr/>
-                  </pic:nvPicPr>
-                  <pic:blipFill>
-                    <a:blip r:embed="rId14"/>
-                    <a:stretch>
-                      <a:fillRect/>
-                    </a:stretch>
-                  </pic:blipFill>
-                  <pic:spPr>
-                    <a:xfrm>
-                      <a:off x="0" y="0"/>
-                      <a:ext cx="5760000" cy="3240000"/>
-                    </a:xfrm>
-                    <a:prstGeom prst="rect"/>
-                  </pic:spPr>
-                </pic:pic>
-              </a:graphicData>
-            </a:graphic>
-          </wp:inline>
-        </w:drawing>
+        <w:rPr>
+          <w:rFonts w:ascii="Times New Roman" w:hAnsi="Times New Roman"/>
+          <w:b/>
+          <w:sz w:val="28"/>
+        </w:rPr>
+        <w:t xml:space="preserve">9. </w:t>
+      </w:r>
+      <w:r>
+        <w:rPr>
+          <w:rFonts w:ascii="Times New Roman" w:hAnsi="Times New Roman"/>
+          <w:sz w:val="28"/>
+        </w:rPr>
+        <w:t>итог проекта.</w:t>
       </w:r>
     </w:p>
     <w:p>
       <w:pPr>
-        <w:spacing w:before="80" w:after="240"/>
-        <w:jc w:val="center"/>
+        <w:spacing w:line="276" w:lineRule="auto" w:after="120"/>
+        <w:ind w:firstLine="709"/>
+        <w:jc w:val="both"/>
       </w:pPr>
       <w:r>
         <w:rPr>
           <w:rFonts w:ascii="Times New Roman" w:hAnsi="Times New Roman"/>
-          <w:i/>
-          <w:sz w:val="24"/>
+          <w:sz w:val="28"/>
         </w:rPr>
-        <w:t>Рисунок 5 — Структура портала</w:t>
-      </w:r>
-    </w:p>
-    <w:p>
-      <w:pPr>
-        <w:spacing w:before="200" w:after="80"/>
-        <w:jc w:val="center"/>
-      </w:pPr>
-      <w:r>
-        <w:drawing>
-          <wp:inline xmlns:a="http://schemas.openxmlformats.org/drawingml/2006/main" xmlns:pic="http://schemas.openxmlformats.org/drawingml/2006/picture">
-            <wp:extent cx="5760000" cy="3240000"/>
-            <wp:docPr id="6" name="Picture 6"/>
-            <wp:cNvGraphicFramePr>
-              <a:graphicFrameLocks noChangeAspect="1"/>
-            </wp:cNvGraphicFramePr>
-            <a:graphic>
-              <a:graphicData uri="http://schemas.openxmlformats.org/drawingml/2006/picture">
-                <pic:pic>
-                  <pic:nvPicPr>
-                    <pic:cNvPr id="0" name="slide_06_fgos_validation.png"/>
-                    <pic:cNvPicPr/>
-                  </pic:nvPicPr>
-                  <pic:blipFill>
-                    <a:blip r:embed="rId15"/>
-                    <a:stretch>
-                      <a:fillRect/>
-                    </a:stretch>
-                  </pic:blipFill>
-                  <pic:spPr>
-                    <a:xfrm>
-                      <a:off x="0" y="0"/>
-                      <a:ext cx="5760000" cy="3240000"/>
-                    </a:xfrm>
-                    <a:prstGeom prst="rect"/>
-                  </pic:spPr>
-                </pic:pic>
-              </a:graphicData>
-            </a:graphic>
-          </wp:inline>
-        </w:drawing>
-      </w:r>
-    </w:p>
-    <w:p>
-      <w:pPr>
-        <w:spacing w:before="80" w:after="240"/>
-        <w:jc w:val="center"/>
-      </w:pPr>
-      <w:r>
-        <w:rPr>
-          <w:rFonts w:ascii="Times New Roman" w:hAnsi="Times New Roman"/>
-          <w:i/>
-          <w:sz w:val="24"/>
-        </w:rPr>
-        <w:t>Рисунок 6 — Проверка ФГОС</w:t>
-      </w:r>
-    </w:p>
-    <w:p>
-      <w:pPr>
-        <w:spacing w:before="200" w:after="80"/>
-        <w:jc w:val="center"/>
-      </w:pPr>
-      <w:r>
-        <w:drawing>
-          <wp:inline xmlns:a="http://schemas.openxmlformats.org/drawingml/2006/main" xmlns:pic="http://schemas.openxmlformats.org/drawingml/2006/picture">
-            <wp:extent cx="5760000" cy="3240000"/>
-            <wp:docPr id="7" name="Picture 7"/>
-            <wp:cNvGraphicFramePr>
-              <a:graphicFrameLocks noChangeAspect="1"/>
-            </wp:cNvGraphicFramePr>
-            <a:graphic>
-              <a:graphicData uri="http://schemas.openxmlformats.org/drawingml/2006/picture">
-                <pic:pic>
-                  <pic:nvPicPr>
-                    <pic:cNvPr id="0" name="slide_07_visual_diff.png"/>
-                    <pic:cNvPicPr/>
-                  </pic:nvPicPr>
-                  <pic:blipFill>
-                    <a:blip r:embed="rId16"/>
-                    <a:stretch>
-                      <a:fillRect/>
-                    </a:stretch>
-                  </pic:blipFill>
-                  <pic:spPr>
-                    <a:xfrm>
-                      <a:off x="0" y="0"/>
-                      <a:ext cx="5760000" cy="3240000"/>
-                    </a:xfrm>
-                    <a:prstGeom prst="rect"/>
-                  </pic:spPr>
-                </pic:pic>
-              </a:graphicData>
-            </a:graphic>
-          </wp:inline>
-        </w:drawing>
-      </w:r>
-    </w:p>
-    <w:p>
-      <w:pPr>
-        <w:spacing w:before="80" w:after="240"/>
-        <w:jc w:val="center"/>
-      </w:pPr>
-      <w:r>
-        <w:rPr>
-          <w:rFonts w:ascii="Times New Roman" w:hAnsi="Times New Roman"/>
-          <w:i/>
-          <w:sz w:val="24"/>
-        </w:rPr>
-        <w:t>Рисунок 7 — Изменения учебного плана</w:t>
-      </w:r>
-    </w:p>
-    <w:p>
-      <w:pPr>
-        <w:spacing w:before="200" w:after="80"/>
-        <w:jc w:val="center"/>
-      </w:pPr>
-      <w:r>
-        <w:drawing>
-          <wp:inline xmlns:a="http://schemas.openxmlformats.org/drawingml/2006/main" xmlns:pic="http://schemas.openxmlformats.org/drawingml/2006/picture">
-            <wp:extent cx="5760000" cy="3240000"/>
-            <wp:docPr id="8" name="Picture 8"/>
-            <wp:cNvGraphicFramePr>
-              <a:graphicFrameLocks noChangeAspect="1"/>
-            </wp:cNvGraphicFramePr>
-            <a:graphic>
-              <a:graphicData uri="http://schemas.openxmlformats.org/drawingml/2006/picture">
-                <pic:pic>
-                  <pic:nvPicPr>
-                    <pic:cNvPr id="0" name="slide_08_crypto_signature.png"/>
-                    <pic:cNvPicPr/>
-                  </pic:nvPicPr>
-                  <pic:blipFill>
-                    <a:blip r:embed="rId17"/>
-                    <a:stretch>
-                      <a:fillRect/>
-                    </a:stretch>
-                  </pic:blipFill>
-                  <pic:spPr>
-                    <a:xfrm>
-                      <a:off x="0" y="0"/>
-                      <a:ext cx="5760000" cy="3240000"/>
-                    </a:xfrm>
-                    <a:prstGeom prst="rect"/>
-                  </pic:spPr>
-                </pic:pic>
-              </a:graphicData>
-            </a:graphic>
-          </wp:inline>
-        </w:drawing>
-      </w:r>
-    </w:p>
-    <w:p>
-      <w:pPr>
-        <w:spacing w:before="80" w:after="240"/>
-        <w:jc w:val="center"/>
-      </w:pPr>
-      <w:r>
-        <w:rPr>
-          <w:rFonts w:ascii="Times New Roman" w:hAnsi="Times New Roman"/>
-          <w:i/>
-          <w:sz w:val="24"/>
-        </w:rPr>
-        <w:t>Рисунок 8 — Согласование</w:t>
-      </w:r>
-    </w:p>
-    <w:p>
-      <w:pPr>
-        <w:spacing w:before="200" w:after="80"/>
-        <w:jc w:val="center"/>
-      </w:pPr>
-      <w:r>
-        <w:drawing>
-          <wp:inline xmlns:a="http://schemas.openxmlformats.org/drawingml/2006/main" xmlns:pic="http://schemas.openxmlformats.org/drawingml/2006/picture">
-            <wp:extent cx="5760000" cy="3240000"/>
-            <wp:docPr id="9" name="Picture 9"/>
-            <wp:cNvGraphicFramePr>
-              <a:graphicFrameLocks noChangeAspect="1"/>
-            </wp:cNvGraphicFramePr>
-            <a:graphic>
-              <a:graphicData uri="http://schemas.openxmlformats.org/drawingml/2006/picture">
-                <pic:pic>
-                  <pic:nvPicPr>
-                    <pic:cNvPr id="0" name="slide_09_analytics_export.png"/>
-                    <pic:cNvPicPr/>
-                  </pic:nvPicPr>
-                  <pic:blipFill>
-                    <a:blip r:embed="rId18"/>
-                    <a:stretch>
-                      <a:fillRect/>
-                    </a:stretch>
-                  </pic:blipFill>
-                  <pic:spPr>
-                    <a:xfrm>
-                      <a:off x="0" y="0"/>
-                      <a:ext cx="5760000" cy="3240000"/>
-                    </a:xfrm>
-                    <a:prstGeom prst="rect"/>
-                  </pic:spPr>
-                </pic:pic>
-              </a:graphicData>
-            </a:graphic>
-          </wp:inline>
-        </w:drawing>
-      </w:r>
-    </w:p>
-    <w:p>
-      <w:pPr>
-        <w:spacing w:before="80" w:after="240"/>
-        <w:jc w:val="center"/>
-      </w:pPr>
-      <w:r>
-        <w:rPr>
-          <w:rFonts w:ascii="Times New Roman" w:hAnsi="Times New Roman"/>
-          <w:i/>
-          <w:sz w:val="24"/>
-        </w:rPr>
-        <w:t>Рисунок 9 — Аналитика и экспорт</w:t>
-      </w:r>
-    </w:p>
-    <w:p>
-      <w:pPr>
-        <w:spacing w:before="200" w:after="80"/>
-        <w:jc w:val="center"/>
-      </w:pPr>
-      <w:r>
-        <w:drawing>
-          <wp:inline xmlns:a="http://schemas.openxmlformats.org/drawingml/2006/main" xmlns:pic="http://schemas.openxmlformats.org/drawingml/2006/picture">
-            <wp:extent cx="5760000" cy="3240000"/>
-            <wp:docPr id="10" name="Picture 10"/>
-            <wp:cNvGraphicFramePr>
-              <a:graphicFrameLocks noChangeAspect="1"/>
-            </wp:cNvGraphicFramePr>
-            <a:graphic>
-              <a:graphicData uri="http://schemas.openxmlformats.org/drawingml/2006/picture">
-                <pic:pic>
-                  <pic:nvPicPr>
-                    <pic:cNvPr id="0" name="slide_10_interactive_ux.png"/>
-                    <pic:cNvPicPr/>
-                  </pic:nvPicPr>
-                  <pic:blipFill>
-                    <a:blip r:embed="rId19"/>
-                    <a:stretch>
-                      <a:fillRect/>
-                    </a:stretch>
-                  </pic:blipFill>
-                  <pic:spPr>
-                    <a:xfrm>
-                      <a:off x="0" y="0"/>
-                      <a:ext cx="5760000" cy="3240000"/>
-                    </a:xfrm>
-                    <a:prstGeom prst="rect"/>
-                  </pic:spPr>
-                </pic:pic>
-              </a:graphicData>
-            </a:graphic>
-          </wp:inline>
-        </w:drawing>
-      </w:r>
-    </w:p>
-    <w:p>
-      <w:pPr>
-        <w:spacing w:before="80" w:after="240"/>
-        <w:jc w:val="center"/>
-      </w:pPr>
-      <w:r>
-        <w:rPr>
-          <w:rFonts w:ascii="Times New Roman" w:hAnsi="Times New Roman"/>
-          <w:i/>
-          <w:sz w:val="24"/>
-        </w:rPr>
-        <w:t>Рисунок 10 — Интерфейс</w:t>
-      </w:r>
-    </w:p>
-    <w:p>
-      <w:pPr>
-        <w:spacing w:before="200" w:after="80"/>
-        <w:jc w:val="center"/>
-      </w:pPr>
-      <w:r>
-        <w:drawing>
-          <wp:inline xmlns:a="http://schemas.openxmlformats.org/drawingml/2006/main" xmlns:pic="http://schemas.openxmlformats.org/drawingml/2006/picture">
-            <wp:extent cx="5760000" cy="3240000"/>
-            <wp:docPr id="11" name="Picture 11"/>
-            <wp:cNvGraphicFramePr>
-              <a:graphicFrameLocks noChangeAspect="1"/>
-            </wp:cNvGraphicFramePr>
-            <a:graphic>
-              <a:graphicData uri="http://schemas.openxmlformats.org/drawingml/2006/picture">
-                <pic:pic>
-                  <pic:nvPicPr>
-                    <pic:cNvPr id="0" name="slide_11_testing_security.png"/>
-                    <pic:cNvPicPr/>
-                  </pic:nvPicPr>
-                  <pic:blipFill>
-                    <a:blip r:embed="rId20"/>
-                    <a:stretch>
-                      <a:fillRect/>
-                    </a:stretch>
-                  </pic:blipFill>
-                  <pic:spPr>
-                    <a:xfrm>
-                      <a:off x="0" y="0"/>
-                      <a:ext cx="5760000" cy="3240000"/>
-                    </a:xfrm>
-                    <a:prstGeom prst="rect"/>
-                  </pic:spPr>
-                </pic:pic>
-              </a:graphicData>
-            </a:graphic>
-          </wp:inline>
-        </w:drawing>
-      </w:r>
-    </w:p>
-    <w:p>
-      <w:pPr>
-        <w:spacing w:before="80" w:after="240"/>
-        <w:jc w:val="center"/>
-      </w:pPr>
-      <w:r>
-        <w:rPr>
-          <w:rFonts w:ascii="Times New Roman" w:hAnsi="Times New Roman"/>
-          <w:i/>
-          <w:sz w:val="24"/>
-        </w:rPr>
-        <w:t>Рисунок 11 — Проверка и безопасность</w:t>
-      </w:r>
-    </w:p>
-    <w:p>
-      <w:pPr>
-        <w:spacing w:before="200" w:after="80"/>
-        <w:jc w:val="center"/>
-      </w:pPr>
-      <w:r>
-        <w:drawing>
-          <wp:inline xmlns:a="http://schemas.openxmlformats.org/drawingml/2006/main" xmlns:pic="http://schemas.openxmlformats.org/drawingml/2006/picture">
-            <wp:extent cx="5760000" cy="3240000"/>
-            <wp:docPr id="12" name="Picture 12"/>
-            <wp:cNvGraphicFramePr>
-              <a:graphicFrameLocks noChangeAspect="1"/>
-            </wp:cNvGraphicFramePr>
-            <a:graphic>
-              <a:graphicData uri="http://schemas.openxmlformats.org/drawingml/2006/picture">
-                <pic:pic>
-                  <pic:nvPicPr>
-                    <pic:cNvPr id="0" name="slide_12_conclusion_impact.png"/>
-                    <pic:cNvPicPr/>
-                  </pic:nvPicPr>
-                  <pic:blipFill>
-                    <a:blip r:embed="rId21"/>
-                    <a:stretch>
-                      <a:fillRect/>
-                    </a:stretch>
-                  </pic:blipFill>
-                  <pic:spPr>
-                    <a:xfrm>
-                      <a:off x="0" y="0"/>
-                      <a:ext cx="5760000" cy="3240000"/>
-                    </a:xfrm>
-                    <a:prstGeom prst="rect"/>
-                  </pic:spPr>
-                </pic:pic>
-              </a:graphicData>
-            </a:graphic>
-          </wp:inline>
-        </w:drawing>
-      </w:r>
-    </w:p>
-    <w:p>
-      <w:pPr>
-        <w:spacing w:before="80" w:after="240"/>
-        <w:jc w:val="center"/>
-      </w:pPr>
-      <w:r>
-        <w:rPr>
-          <w:rFonts w:ascii="Times New Roman" w:hAnsi="Times New Roman"/>
-          <w:i/>
-          <w:sz w:val="24"/>
-        </w:rPr>
-        <w:t>Рисунок 12 — Заключение</w:t>
+        <w:t>В презентации используются только фактические сведения о текущем Flask-приложении и демонстрационной SQLite-базе.</w:t>
       </w:r>
     </w:p>
     <w:p>
@@ -931,7 +495,7 @@
           <w:rFonts w:ascii="Times New Roman" w:hAnsi="Times New Roman"/>
           <w:sz w:val="28"/>
         </w:rPr>
-        <w:t>Портал является локальным учебным прототипом на Flask и SQLite. Он демонстрирует структуру предметной области, навигацию и просмотр демонстрационных данных. Авторизация, изменение данных, полноценный RBAC, настоящая электронная подпись, экспорт и внешние интеграции в текущую реализацию не входят.</w:t>
+        <w:t>Портал является локальным учебным прототипом на Flask и SQLite. Он демонстрирует структуру предметной области, навигацию и просмотр демонстрационных данных. Авторизация, изменение данных, полноценный RBAC, настоящий движок проверки ФГОС, квалифицированная электронная подпись, экспорт и внешние интеграции в текущую реализацию не входят.</w:t>
       </w:r>
     </w:p>
     <w:p>
@@ -959,7 +523,7 @@
           <w:rFonts w:ascii="Times New Roman" w:hAnsi="Times New Roman"/>
           <w:sz w:val="28"/>
         </w:rPr>
-        <w:t>Подготовлены материалы для представления учебного прототипа. Текст отчёта ограничен фактическими возможностями приложения и не содержит заявлений о несуществующих функциях.</w:t>
+        <w:t>Подготовлены материалы для представления учебного прототипа. Текст отчёта, презентация и пояснительная записка ограничены фактическими возможностями приложения и не содержат заявлений о несуществующих функциях.</w:t>
       </w:r>
     </w:p>
     <w:sectPr>

</xml_diff>